<commit_message>
feat(sales): add real-stats section (live DB numbers) + FAQ, renumber 16-19
- new section 16: real statistics extracted from the live demo database
  (overview, classes/capacity with teachers, financial flow, teaching quality)
- new section 19: FAQ (pricing, training, data safety, data migration)
- competitive advantages -> 17, technical specs -> 18
- synced across HTML, MD, regenerated PDF (33 pages) and DOCX (B Nazanin RTL)

Co-authored-by: arena-agent <297053741+arena-agent@users.noreply.github.com>
</commit_message>
<xml_diff>
--- a/sales/AcademyManager-Pro-Sales-Document.docx
+++ b/sales/AcademyManager-Pro-Sales-Document.docx
@@ -3723,6 +3723,1833 @@
           <w:sz w:val="40"/>
           <w:szCs w:val="40"/>
         </w:rPr>
+        <w:t>اعداد واقعی: آمار از یک محیط زنده</w:t>
+      </w:r>
+    </w:p>
+    <w:p>
+      <w:pPr>
+        <w:bidi w:val="1"/>
+        <w:spacing w:after="200" w:before="0"/>
+        <w:ind w:firstLine="357"/>
+        <w:jc w:val="both"/>
+      </w:pPr>
+      <w:r>
+        <w:rPr>
+          <w:rFonts w:ascii="B Nazanin" w:hAnsi="B Nazanin" w:cs="B Nazanin"/>
+          <w:b w:val="0"/>
+          <w:i w:val="0"/>
+          <w:color w:val="222B33"/>
+          <w:sz w:val="28"/>
+          <w:szCs w:val="28"/>
+        </w:rPr>
+        <w:t xml:space="preserve">تا اینجا تصاویر دیدید؛ حالا خودِ اعداد. همه‌ی رقم‌های زیر </w:t>
+      </w:r>
+      <w:r>
+        <w:rPr>
+          <w:rFonts w:ascii="B Nazanin" w:hAnsi="B Nazanin" w:cs="B Nazanin"/>
+          <w:b/>
+          <w:i w:val="0"/>
+          <w:color w:val="222B33"/>
+          <w:sz w:val="28"/>
+          <w:szCs w:val="28"/>
+        </w:rPr>
+        <w:t>دقیقاً در لحظه‌ی تهیه‌ی این داکیومنت از دیتابیس دیتای زنده‌ی نرم‌افزار استخراج</w:t>
+      </w:r>
+      <w:r>
+        <w:rPr>
+          <w:rFonts w:ascii="B Nazanin" w:hAnsi="B Nazanin" w:cs="B Nazanin"/>
+          <w:b w:val="0"/>
+          <w:i w:val="0"/>
+          <w:color w:val="222B33"/>
+          <w:sz w:val="28"/>
+          <w:szCs w:val="28"/>
+        </w:rPr>
+        <w:t xml:space="preserve"> شده‌اند — در آموزشگاه شما، همین آمار‌ها با داده‌های خودتان زنده جابه‌جا می‌شوند.</w:t>
+      </w:r>
+    </w:p>
+    <w:p>
+      <w:pPr>
+        <w:bidi w:val="1"/>
+        <w:spacing w:before="240" w:after="120"/>
+        <w:jc w:val="right"/>
+      </w:pPr>
+      <w:r>
+        <w:rPr>
+          <w:rFonts w:ascii="B Nazanin" w:hAnsi="B Nazanin" w:cs="B Nazanin"/>
+          <w:b/>
+          <w:i w:val="0"/>
+          <w:color w:val="222B33"/>
+          <w:sz w:val="32"/>
+          <w:szCs w:val="32"/>
+        </w:rPr>
+        <w:t>نمای کلی</w:t>
+      </w:r>
+    </w:p>
+    <w:tbl>
+      <w:tblPr>
+        <w:tblW w:type="auto" w:w="0"/>
+        <w:jc w:val="center"/>
+        <w:tblLook w:firstColumn="1" w:firstRow="1" w:lastColumn="0" w:lastRow="0" w:noHBand="0" w:noVBand="1" w:val="04A0"/>
+        <w:tblBorders>
+          <w:top w:val="single" w:sz="4" w:space="0" w:color="D9DDE3"/>
+          <w:left w:val="single" w:sz="4" w:space="0" w:color="D9DDE3"/>
+          <w:bottom w:val="single" w:sz="4" w:space="0" w:color="D9DDE3"/>
+          <w:right w:val="single" w:sz="4" w:space="0" w:color="D9DDE3"/>
+          <w:insideH w:val="single" w:sz="4" w:space="0" w:color="D9DDE3"/>
+          <w:insideV w:val="single" w:sz="4" w:space="0" w:color="D9DDE3"/>
+        </w:tblBorders>
+      </w:tblPr>
+      <w:tblGrid>
+        <w:gridCol w:w="4819"/>
+        <w:gridCol w:w="4819"/>
+      </w:tblGrid>
+      <w:tr>
+        <w:tc>
+          <w:tcPr>
+            <w:tcW w:type="dxa" w:w="4819"/>
+            <w:shd w:val="clear" w:fill="0D47A1"/>
+          </w:tcPr>
+          <w:p>
+            <w:pPr>
+              <w:bidi w:val="1"/>
+              <w:jc w:val="center"/>
+            </w:pPr>
+            <w:r/>
+            <w:r>
+              <w:rPr>
+                <w:rFonts w:ascii="B Nazanin" w:hAnsi="B Nazanin" w:cs="B Nazanin"/>
+                <w:b/>
+                <w:i w:val="0"/>
+                <w:color w:val="FFFFFF"/>
+                <w:sz w:val="24"/>
+                <w:szCs w:val="24"/>
+              </w:rPr>
+              <w:t>مورد</w:t>
+            </w:r>
+          </w:p>
+        </w:tc>
+        <w:tc>
+          <w:tcPr>
+            <w:tcW w:type="dxa" w:w="4819"/>
+            <w:shd w:val="clear" w:fill="0D47A1"/>
+          </w:tcPr>
+          <w:p>
+            <w:pPr>
+              <w:bidi w:val="1"/>
+              <w:jc w:val="center"/>
+            </w:pPr>
+            <w:r/>
+            <w:r>
+              <w:rPr>
+                <w:rFonts w:ascii="B Nazanin" w:hAnsi="B Nazanin" w:cs="B Nazanin"/>
+                <w:b/>
+                <w:i w:val="0"/>
+                <w:color w:val="FFFFFF"/>
+                <w:sz w:val="24"/>
+                <w:szCs w:val="24"/>
+              </w:rPr>
+              <w:t>مقدار</w:t>
+            </w:r>
+          </w:p>
+        </w:tc>
+      </w:tr>
+      <w:tr>
+        <w:tc>
+          <w:tcPr>
+            <w:tcW w:type="dxa" w:w="4819"/>
+          </w:tcPr>
+          <w:p>
+            <w:pPr>
+              <w:bidi w:val="1"/>
+              <w:jc w:val="center"/>
+            </w:pPr>
+            <w:r/>
+            <w:r>
+              <w:rPr>
+                <w:rFonts w:ascii="B Nazanin" w:hAnsi="B Nazanin" w:cs="B Nazanin"/>
+                <w:b w:val="0"/>
+                <w:i w:val="0"/>
+                <w:color w:val="222B33"/>
+                <w:sz w:val="23"/>
+                <w:szCs w:val="23"/>
+              </w:rPr>
+              <w:t>هنرجویان فعال</w:t>
+            </w:r>
+          </w:p>
+        </w:tc>
+        <w:tc>
+          <w:tcPr>
+            <w:tcW w:type="dxa" w:w="4819"/>
+          </w:tcPr>
+          <w:p>
+            <w:pPr>
+              <w:bidi w:val="1"/>
+              <w:jc w:val="center"/>
+            </w:pPr>
+            <w:r/>
+            <w:r>
+              <w:rPr>
+                <w:rFonts w:ascii="B Nazanin" w:hAnsi="B Nazanin" w:cs="B Nazanin"/>
+                <w:b/>
+                <w:i w:val="0"/>
+                <w:color w:val="007A3D"/>
+                <w:sz w:val="23"/>
+                <w:szCs w:val="23"/>
+              </w:rPr>
+              <w:t>۸ نفر (۶ بزرگسال، ۲ نوجوان)</w:t>
+            </w:r>
+          </w:p>
+        </w:tc>
+      </w:tr>
+      <w:tr>
+        <w:tc>
+          <w:tcPr>
+            <w:tcW w:type="dxa" w:w="4819"/>
+            <w:shd w:val="clear" w:fill="F2F5F9"/>
+          </w:tcPr>
+          <w:p>
+            <w:pPr>
+              <w:bidi w:val="1"/>
+              <w:jc w:val="center"/>
+            </w:pPr>
+            <w:r/>
+            <w:r>
+              <w:rPr>
+                <w:rFonts w:ascii="B Nazanin" w:hAnsi="B Nazanin" w:cs="B Nazanin"/>
+                <w:b w:val="0"/>
+                <w:i w:val="0"/>
+                <w:color w:val="222B33"/>
+                <w:sz w:val="23"/>
+                <w:szCs w:val="23"/>
+              </w:rPr>
+              <w:t>تیم آموزشی</w:t>
+            </w:r>
+          </w:p>
+        </w:tc>
+        <w:tc>
+          <w:tcPr>
+            <w:tcW w:type="dxa" w:w="4819"/>
+            <w:shd w:val="clear" w:fill="F2F5F9"/>
+          </w:tcPr>
+          <w:p>
+            <w:pPr>
+              <w:bidi w:val="1"/>
+              <w:jc w:val="center"/>
+            </w:pPr>
+            <w:r/>
+            <w:r>
+              <w:rPr>
+                <w:rFonts w:ascii="B Nazanin" w:hAnsi="B Nazanin" w:cs="B Nazanin"/>
+                <w:b w:val="0"/>
+                <w:i w:val="0"/>
+                <w:color w:val="222B33"/>
+                <w:sz w:val="23"/>
+                <w:szCs w:val="23"/>
+              </w:rPr>
+              <w:t>۳ مدرس</w:t>
+            </w:r>
+          </w:p>
+        </w:tc>
+      </w:tr>
+      <w:tr>
+        <w:tc>
+          <w:tcPr>
+            <w:tcW w:type="dxa" w:w="4819"/>
+          </w:tcPr>
+          <w:p>
+            <w:pPr>
+              <w:bidi w:val="1"/>
+              <w:jc w:val="center"/>
+            </w:pPr>
+            <w:r/>
+            <w:r>
+              <w:rPr>
+                <w:rFonts w:ascii="B Nazanin" w:hAnsi="B Nazanin" w:cs="B Nazanin"/>
+                <w:b w:val="0"/>
+                <w:i w:val="0"/>
+                <w:color w:val="222B33"/>
+                <w:sz w:val="23"/>
+                <w:szCs w:val="23"/>
+              </w:rPr>
+              <w:t>دوره‌های فعال</w:t>
+            </w:r>
+          </w:p>
+        </w:tc>
+        <w:tc>
+          <w:tcPr>
+            <w:tcW w:type="dxa" w:w="4819"/>
+          </w:tcPr>
+          <w:p>
+            <w:pPr>
+              <w:bidi w:val="1"/>
+              <w:jc w:val="center"/>
+            </w:pPr>
+            <w:r/>
+            <w:r>
+              <w:rPr>
+                <w:rFonts w:ascii="B Nazanin" w:hAnsi="B Nazanin" w:cs="B Nazanin"/>
+                <w:b w:val="0"/>
+                <w:i w:val="0"/>
+                <w:color w:val="222B33"/>
+                <w:sz w:val="23"/>
+                <w:szCs w:val="23"/>
+              </w:rPr>
+              <w:t>۵ دوره</w:t>
+            </w:r>
+          </w:p>
+        </w:tc>
+      </w:tr>
+      <w:tr>
+        <w:tc>
+          <w:tcPr>
+            <w:tcW w:type="dxa" w:w="4819"/>
+            <w:shd w:val="clear" w:fill="F2F5F9"/>
+          </w:tcPr>
+          <w:p>
+            <w:pPr>
+              <w:bidi w:val="1"/>
+              <w:jc w:val="center"/>
+            </w:pPr>
+            <w:r/>
+            <w:r>
+              <w:rPr>
+                <w:rFonts w:ascii="B Nazanin" w:hAnsi="B Nazanin" w:cs="B Nazanin"/>
+                <w:b w:val="0"/>
+                <w:i w:val="0"/>
+                <w:color w:val="222B33"/>
+                <w:sz w:val="23"/>
+                <w:szCs w:val="23"/>
+              </w:rPr>
+              <w:t>کلاس‌های فعال</w:t>
+            </w:r>
+          </w:p>
+        </w:tc>
+        <w:tc>
+          <w:tcPr>
+            <w:tcW w:type="dxa" w:w="4819"/>
+            <w:shd w:val="clear" w:fill="F2F5F9"/>
+          </w:tcPr>
+          <w:p>
+            <w:pPr>
+              <w:bidi w:val="1"/>
+              <w:jc w:val="center"/>
+            </w:pPr>
+            <w:r/>
+            <w:r>
+              <w:rPr>
+                <w:rFonts w:ascii="B Nazanin" w:hAnsi="B Nazanin" w:cs="B Nazanin"/>
+                <w:b w:val="0"/>
+                <w:i w:val="0"/>
+                <w:color w:val="222B33"/>
+                <w:sz w:val="23"/>
+                <w:szCs w:val="23"/>
+              </w:rPr>
+              <w:t>۳ کلاس</w:t>
+            </w:r>
+          </w:p>
+        </w:tc>
+      </w:tr>
+      <w:tr>
+        <w:tc>
+          <w:tcPr>
+            <w:tcW w:type="dxa" w:w="4819"/>
+          </w:tcPr>
+          <w:p>
+            <w:pPr>
+              <w:bidi w:val="1"/>
+              <w:jc w:val="center"/>
+            </w:pPr>
+            <w:r/>
+            <w:r>
+              <w:rPr>
+                <w:rFonts w:ascii="B Nazanin" w:hAnsi="B Nazanin" w:cs="B Nazanin"/>
+                <w:b w:val="0"/>
+                <w:i w:val="0"/>
+                <w:color w:val="222B33"/>
+                <w:sz w:val="23"/>
+                <w:szCs w:val="23"/>
+              </w:rPr>
+              <w:t>جلسات برگزارشده</w:t>
+            </w:r>
+          </w:p>
+        </w:tc>
+        <w:tc>
+          <w:tcPr>
+            <w:tcW w:type="dxa" w:w="4819"/>
+          </w:tcPr>
+          <w:p>
+            <w:pPr>
+              <w:bidi w:val="1"/>
+              <w:jc w:val="center"/>
+            </w:pPr>
+            <w:r/>
+            <w:r>
+              <w:rPr>
+                <w:rFonts w:ascii="B Nazanin" w:hAnsi="B Nazanin" w:cs="B Nazanin"/>
+                <w:b w:val="0"/>
+                <w:i w:val="0"/>
+                <w:color w:val="222B33"/>
+                <w:sz w:val="23"/>
+                <w:szCs w:val="23"/>
+              </w:rPr>
+              <w:t>۸ جلسه</w:t>
+            </w:r>
+          </w:p>
+        </w:tc>
+      </w:tr>
+      <w:tr>
+        <w:tc>
+          <w:tcPr>
+            <w:tcW w:type="dxa" w:w="4819"/>
+            <w:shd w:val="clear" w:fill="F2F5F9"/>
+          </w:tcPr>
+          <w:p>
+            <w:pPr>
+              <w:bidi w:val="1"/>
+              <w:jc w:val="center"/>
+            </w:pPr>
+            <w:r/>
+            <w:r>
+              <w:rPr>
+                <w:rFonts w:ascii="B Nazanin" w:hAnsi="B Nazanin" w:cs="B Nazanin"/>
+                <w:b w:val="0"/>
+                <w:i w:val="0"/>
+                <w:color w:val="222B33"/>
+                <w:sz w:val="23"/>
+                <w:szCs w:val="23"/>
+              </w:rPr>
+              <w:t>ثبت‌نام‌های فعال</w:t>
+            </w:r>
+          </w:p>
+        </w:tc>
+        <w:tc>
+          <w:tcPr>
+            <w:tcW w:type="dxa" w:w="4819"/>
+            <w:shd w:val="clear" w:fill="F2F5F9"/>
+          </w:tcPr>
+          <w:p>
+            <w:pPr>
+              <w:bidi w:val="1"/>
+              <w:jc w:val="center"/>
+            </w:pPr>
+            <w:r/>
+            <w:r>
+              <w:rPr>
+                <w:rFonts w:ascii="B Nazanin" w:hAnsi="B Nazanin" w:cs="B Nazanin"/>
+                <w:b w:val="0"/>
+                <w:i w:val="0"/>
+                <w:color w:val="222B33"/>
+                <w:sz w:val="23"/>
+                <w:szCs w:val="23"/>
+              </w:rPr>
+              <w:t>۱۰ ثبت‌نام</w:t>
+            </w:r>
+          </w:p>
+        </w:tc>
+      </w:tr>
+      <w:tr>
+        <w:tc>
+          <w:tcPr>
+            <w:tcW w:type="dxa" w:w="4819"/>
+          </w:tcPr>
+          <w:p>
+            <w:pPr>
+              <w:bidi w:val="1"/>
+              <w:jc w:val="center"/>
+            </w:pPr>
+            <w:r/>
+            <w:r>
+              <w:rPr>
+                <w:rFonts w:ascii="B Nazanin" w:hAnsi="B Nazanin" w:cs="B Nazanin"/>
+                <w:b w:val="0"/>
+                <w:i w:val="0"/>
+                <w:color w:val="222B33"/>
+                <w:sz w:val="23"/>
+                <w:szCs w:val="23"/>
+              </w:rPr>
+              <w:t>دریافتی کل (۹ رسید)</w:t>
+            </w:r>
+          </w:p>
+        </w:tc>
+        <w:tc>
+          <w:tcPr>
+            <w:tcW w:type="dxa" w:w="4819"/>
+          </w:tcPr>
+          <w:p>
+            <w:pPr>
+              <w:bidi w:val="1"/>
+              <w:jc w:val="center"/>
+            </w:pPr>
+            <w:r/>
+            <w:r>
+              <w:rPr>
+                <w:rFonts w:ascii="B Nazanin" w:hAnsi="B Nazanin" w:cs="B Nazanin"/>
+                <w:b/>
+                <w:i w:val="0"/>
+                <w:color w:val="007A3D"/>
+                <w:sz w:val="23"/>
+                <w:szCs w:val="23"/>
+              </w:rPr>
+              <w:t>۴۲,۵۰۰,۰۰ تومان</w:t>
+            </w:r>
+          </w:p>
+        </w:tc>
+      </w:tr>
+      <w:tr>
+        <w:tc>
+          <w:tcPr>
+            <w:tcW w:type="dxa" w:w="4819"/>
+            <w:shd w:val="clear" w:fill="F2F5F9"/>
+          </w:tcPr>
+          <w:p>
+            <w:pPr>
+              <w:bidi w:val="1"/>
+              <w:jc w:val="center"/>
+            </w:pPr>
+            <w:r/>
+            <w:r>
+              <w:rPr>
+                <w:rFonts w:ascii="B Nazanin" w:hAnsi="B Nazanin" w:cs="B Nazanin"/>
+                <w:b w:val="0"/>
+                <w:i w:val="0"/>
+                <w:color w:val="222B33"/>
+                <w:sz w:val="23"/>
+                <w:szCs w:val="23"/>
+              </w:rPr>
+              <w:t>اسناد حسابداری ثبت‌شده</w:t>
+            </w:r>
+          </w:p>
+        </w:tc>
+        <w:tc>
+          <w:tcPr>
+            <w:tcW w:type="dxa" w:w="4819"/>
+            <w:shd w:val="clear" w:fill="F2F5F9"/>
+          </w:tcPr>
+          <w:p>
+            <w:pPr>
+              <w:bidi w:val="1"/>
+              <w:jc w:val="center"/>
+            </w:pPr>
+            <w:r/>
+            <w:r>
+              <w:rPr>
+                <w:rFonts w:ascii="B Nazanin" w:hAnsi="B Nazanin" w:cs="B Nazanin"/>
+                <w:b w:val="0"/>
+                <w:i w:val="0"/>
+                <w:color w:val="222B33"/>
+                <w:sz w:val="23"/>
+                <w:szCs w:val="23"/>
+              </w:rPr>
+              <w:t>۴ سند</w:t>
+            </w:r>
+          </w:p>
+        </w:tc>
+      </w:tr>
+    </w:tbl>
+    <w:p>
+      <w:pPr>
+        <w:spacing w:after="80"/>
+      </w:pPr>
+    </w:p>
+    <w:p>
+      <w:pPr>
+        <w:bidi w:val="1"/>
+        <w:spacing w:before="240" w:after="120"/>
+        <w:jc w:val="right"/>
+      </w:pPr>
+      <w:r>
+        <w:rPr>
+          <w:rFonts w:ascii="B Nazanin" w:hAnsi="B Nazanin" w:cs="B Nazanin"/>
+          <w:b/>
+          <w:i w:val="0"/>
+          <w:color w:val="222B33"/>
+          <w:sz w:val="32"/>
+          <w:szCs w:val="32"/>
+        </w:rPr>
+        <w:t>کلاس‌ها و ظرفیت</w:t>
+      </w:r>
+    </w:p>
+    <w:tbl>
+      <w:tblPr>
+        <w:tblW w:type="auto" w:w="0"/>
+        <w:jc w:val="center"/>
+        <w:tblLook w:firstColumn="1" w:firstRow="1" w:lastColumn="0" w:lastRow="0" w:noHBand="0" w:noVBand="1" w:val="04A0"/>
+        <w:tblBorders>
+          <w:top w:val="single" w:sz="4" w:space="0" w:color="D9DDE3"/>
+          <w:left w:val="single" w:sz="4" w:space="0" w:color="D9DDE3"/>
+          <w:bottom w:val="single" w:sz="4" w:space="0" w:color="D9DDE3"/>
+          <w:right w:val="single" w:sz="4" w:space="0" w:color="D9DDE3"/>
+          <w:insideH w:val="single" w:sz="4" w:space="0" w:color="D9DDE3"/>
+          <w:insideV w:val="single" w:sz="4" w:space="0" w:color="D9DDE3"/>
+        </w:tblBorders>
+      </w:tblPr>
+      <w:tblGrid>
+        <w:gridCol w:w="2409"/>
+        <w:gridCol w:w="2409"/>
+        <w:gridCol w:w="2409"/>
+        <w:gridCol w:w="2409"/>
+      </w:tblGrid>
+      <w:tr>
+        <w:tc>
+          <w:tcPr>
+            <w:tcW w:type="dxa" w:w="2409"/>
+            <w:shd w:val="clear" w:fill="0D47A1"/>
+          </w:tcPr>
+          <w:p>
+            <w:pPr>
+              <w:bidi w:val="1"/>
+              <w:jc w:val="center"/>
+            </w:pPr>
+            <w:r/>
+            <w:r>
+              <w:rPr>
+                <w:rFonts w:ascii="B Nazanin" w:hAnsi="B Nazanin" w:cs="B Nazanin"/>
+                <w:b/>
+                <w:i w:val="0"/>
+                <w:color w:val="FFFFFF"/>
+                <w:sz w:val="24"/>
+                <w:szCs w:val="24"/>
+              </w:rPr>
+              <w:t>کلاس</w:t>
+            </w:r>
+          </w:p>
+        </w:tc>
+        <w:tc>
+          <w:tcPr>
+            <w:tcW w:type="dxa" w:w="2409"/>
+            <w:shd w:val="clear" w:fill="0D47A1"/>
+          </w:tcPr>
+          <w:p>
+            <w:pPr>
+              <w:bidi w:val="1"/>
+              <w:jc w:val="center"/>
+            </w:pPr>
+            <w:r/>
+            <w:r>
+              <w:rPr>
+                <w:rFonts w:ascii="B Nazanin" w:hAnsi="B Nazanin" w:cs="B Nazanin"/>
+                <w:b/>
+                <w:i w:val="0"/>
+                <w:color w:val="FFFFFF"/>
+                <w:sz w:val="24"/>
+                <w:szCs w:val="24"/>
+              </w:rPr>
+              <w:t>مدرس</w:t>
+            </w:r>
+          </w:p>
+        </w:tc>
+        <w:tc>
+          <w:tcPr>
+            <w:tcW w:type="dxa" w:w="2409"/>
+            <w:shd w:val="clear" w:fill="0D47A1"/>
+          </w:tcPr>
+          <w:p>
+            <w:pPr>
+              <w:bidi w:val="1"/>
+              <w:jc w:val="center"/>
+            </w:pPr>
+            <w:r/>
+            <w:r>
+              <w:rPr>
+                <w:rFonts w:ascii="B Nazanin" w:hAnsi="B Nazanin" w:cs="B Nazanin"/>
+                <w:b/>
+                <w:i w:val="0"/>
+                <w:color w:val="FFFFFF"/>
+                <w:sz w:val="24"/>
+                <w:szCs w:val="24"/>
+              </w:rPr>
+              <w:t>ثبت‌نام‌شده</w:t>
+            </w:r>
+          </w:p>
+        </w:tc>
+        <w:tc>
+          <w:tcPr>
+            <w:tcW w:type="dxa" w:w="2409"/>
+            <w:shd w:val="clear" w:fill="0D47A1"/>
+          </w:tcPr>
+          <w:p>
+            <w:pPr>
+              <w:bidi w:val="1"/>
+              <w:jc w:val="center"/>
+            </w:pPr>
+            <w:r/>
+            <w:r>
+              <w:rPr>
+                <w:rFonts w:ascii="B Nazanin" w:hAnsi="B Nazanin" w:cs="B Nazanin"/>
+                <w:b/>
+                <w:i w:val="0"/>
+                <w:color w:val="FFFFFF"/>
+                <w:sz w:val="24"/>
+                <w:szCs w:val="24"/>
+              </w:rPr>
+              <w:t>نرخ اشغال</w:t>
+            </w:r>
+          </w:p>
+        </w:tc>
+      </w:tr>
+      <w:tr>
+        <w:tc>
+          <w:tcPr>
+            <w:tcW w:type="dxa" w:w="2409"/>
+          </w:tcPr>
+          <w:p>
+            <w:pPr>
+              <w:bidi w:val="1"/>
+              <w:jc w:val="center"/>
+            </w:pPr>
+            <w:r/>
+            <w:r>
+              <w:rPr>
+                <w:rFonts w:ascii="B Nazanin" w:hAnsi="B Nazanin" w:cs="B Nazanin"/>
+                <w:b w:val="0"/>
+                <w:i w:val="0"/>
+                <w:color w:val="222B33"/>
+                <w:sz w:val="23"/>
+                <w:szCs w:val="23"/>
+              </w:rPr>
+              <w:t>Python گروه ۱</w:t>
+            </w:r>
+          </w:p>
+        </w:tc>
+        <w:tc>
+          <w:tcPr>
+            <w:tcW w:type="dxa" w:w="2409"/>
+          </w:tcPr>
+          <w:p>
+            <w:pPr>
+              <w:bidi w:val="1"/>
+              <w:jc w:val="center"/>
+            </w:pPr>
+            <w:r/>
+            <w:r>
+              <w:rPr>
+                <w:rFonts w:ascii="B Nazanin" w:hAnsi="B Nazanin" w:cs="B Nazanin"/>
+                <w:b w:val="0"/>
+                <w:i w:val="0"/>
+                <w:color w:val="222B33"/>
+                <w:sz w:val="23"/>
+                <w:szCs w:val="23"/>
+              </w:rPr>
+              <w:t>علی احمدی</w:t>
+            </w:r>
+          </w:p>
+        </w:tc>
+        <w:tc>
+          <w:tcPr>
+            <w:tcW w:type="dxa" w:w="2409"/>
+          </w:tcPr>
+          <w:p>
+            <w:pPr>
+              <w:bidi w:val="1"/>
+              <w:jc w:val="center"/>
+            </w:pPr>
+            <w:r/>
+            <w:r>
+              <w:rPr>
+                <w:rFonts w:ascii="B Nazanin" w:hAnsi="B Nazanin" w:cs="B Nazanin"/>
+                <w:b w:val="0"/>
+                <w:i w:val="0"/>
+                <w:color w:val="222B33"/>
+                <w:sz w:val="23"/>
+                <w:szCs w:val="23"/>
+              </w:rPr>
+              <w:t>۳ از ۱۲</w:t>
+            </w:r>
+          </w:p>
+        </w:tc>
+        <w:tc>
+          <w:tcPr>
+            <w:tcW w:type="dxa" w:w="2409"/>
+          </w:tcPr>
+          <w:p>
+            <w:pPr>
+              <w:bidi w:val="1"/>
+              <w:jc w:val="center"/>
+            </w:pPr>
+            <w:r/>
+            <w:r>
+              <w:rPr>
+                <w:rFonts w:ascii="B Nazanin" w:hAnsi="B Nazanin" w:cs="B Nazanin"/>
+                <w:b/>
+                <w:i w:val="0"/>
+                <w:color w:val="007A3D"/>
+                <w:sz w:val="23"/>
+                <w:szCs w:val="23"/>
+              </w:rPr>
+              <w:t>۲۵٪</w:t>
+            </w:r>
+          </w:p>
+        </w:tc>
+      </w:tr>
+      <w:tr>
+        <w:tc>
+          <w:tcPr>
+            <w:tcW w:type="dxa" w:w="2409"/>
+            <w:shd w:val="clear" w:fill="F2F5F9"/>
+          </w:tcPr>
+          <w:p>
+            <w:pPr>
+              <w:bidi w:val="1"/>
+              <w:jc w:val="center"/>
+            </w:pPr>
+            <w:r/>
+            <w:r>
+              <w:rPr>
+                <w:rFonts w:ascii="B Nazanin" w:hAnsi="B Nazanin" w:cs="B Nazanin"/>
+                <w:b w:val="0"/>
+                <w:i w:val="0"/>
+                <w:color w:val="222B33"/>
+                <w:sz w:val="23"/>
+                <w:szCs w:val="23"/>
+              </w:rPr>
+              <w:t>ICDL گروه ۱</w:t>
+            </w:r>
+          </w:p>
+        </w:tc>
+        <w:tc>
+          <w:tcPr>
+            <w:tcW w:type="dxa" w:w="2409"/>
+            <w:shd w:val="clear" w:fill="F2F5F9"/>
+          </w:tcPr>
+          <w:p>
+            <w:pPr>
+              <w:bidi w:val="1"/>
+              <w:jc w:val="center"/>
+            </w:pPr>
+            <w:r/>
+            <w:r>
+              <w:rPr>
+                <w:rFonts w:ascii="B Nazanin" w:hAnsi="B Nazanin" w:cs="B Nazanin"/>
+                <w:b w:val="0"/>
+                <w:i w:val="0"/>
+                <w:color w:val="222B33"/>
+                <w:sz w:val="23"/>
+                <w:szCs w:val="23"/>
+              </w:rPr>
+              <w:t>مریم رضایی</w:t>
+            </w:r>
+          </w:p>
+        </w:tc>
+        <w:tc>
+          <w:tcPr>
+            <w:tcW w:type="dxa" w:w="2409"/>
+            <w:shd w:val="clear" w:fill="F2F5F9"/>
+          </w:tcPr>
+          <w:p>
+            <w:pPr>
+              <w:bidi w:val="1"/>
+              <w:jc w:val="center"/>
+            </w:pPr>
+            <w:r/>
+            <w:r>
+              <w:rPr>
+                <w:rFonts w:ascii="B Nazanin" w:hAnsi="B Nazanin" w:cs="B Nazanin"/>
+                <w:b w:val="0"/>
+                <w:i w:val="0"/>
+                <w:color w:val="222B33"/>
+                <w:sz w:val="23"/>
+                <w:szCs w:val="23"/>
+              </w:rPr>
+              <w:t>۳ از ۱۵</w:t>
+            </w:r>
+          </w:p>
+        </w:tc>
+        <w:tc>
+          <w:tcPr>
+            <w:tcW w:type="dxa" w:w="2409"/>
+            <w:shd w:val="clear" w:fill="F2F5F9"/>
+          </w:tcPr>
+          <w:p>
+            <w:pPr>
+              <w:bidi w:val="1"/>
+              <w:jc w:val="center"/>
+            </w:pPr>
+            <w:r/>
+            <w:r>
+              <w:rPr>
+                <w:rFonts w:ascii="B Nazanin" w:hAnsi="B Nazanin" w:cs="B Nazanin"/>
+                <w:b/>
+                <w:i w:val="0"/>
+                <w:color w:val="007A3D"/>
+                <w:sz w:val="23"/>
+                <w:szCs w:val="23"/>
+              </w:rPr>
+              <w:t>۲۰٪</w:t>
+            </w:r>
+          </w:p>
+        </w:tc>
+      </w:tr>
+      <w:tr>
+        <w:tc>
+          <w:tcPr>
+            <w:tcW w:type="dxa" w:w="2409"/>
+          </w:tcPr>
+          <w:p>
+            <w:pPr>
+              <w:bidi w:val="1"/>
+              <w:jc w:val="center"/>
+            </w:pPr>
+            <w:r/>
+            <w:r>
+              <w:rPr>
+                <w:rFonts w:ascii="B Nazanin" w:hAnsi="B Nazanin" w:cs="B Nazanin"/>
+                <w:b w:val="0"/>
+                <w:i w:val="0"/>
+                <w:color w:val="222B33"/>
+                <w:sz w:val="23"/>
+                <w:szCs w:val="23"/>
+              </w:rPr>
+              <w:t>حسابداری گروه ۱</w:t>
+            </w:r>
+          </w:p>
+        </w:tc>
+        <w:tc>
+          <w:tcPr>
+            <w:tcW w:type="dxa" w:w="2409"/>
+          </w:tcPr>
+          <w:p>
+            <w:pPr>
+              <w:bidi w:val="1"/>
+              <w:jc w:val="center"/>
+            </w:pPr>
+            <w:r/>
+            <w:r>
+              <w:rPr>
+                <w:rFonts w:ascii="B Nazanin" w:hAnsi="B Nazanin" w:cs="B Nazanin"/>
+                <w:b w:val="0"/>
+                <w:i w:val="0"/>
+                <w:color w:val="222B33"/>
+                <w:sz w:val="23"/>
+                <w:szCs w:val="23"/>
+              </w:rPr>
+              <w:t>حسن کریمی</w:t>
+            </w:r>
+          </w:p>
+        </w:tc>
+        <w:tc>
+          <w:tcPr>
+            <w:tcW w:type="dxa" w:w="2409"/>
+          </w:tcPr>
+          <w:p>
+            <w:pPr>
+              <w:bidi w:val="1"/>
+              <w:jc w:val="center"/>
+            </w:pPr>
+            <w:r/>
+            <w:r>
+              <w:rPr>
+                <w:rFonts w:ascii="B Nazanin" w:hAnsi="B Nazanin" w:cs="B Nazanin"/>
+                <w:b w:val="0"/>
+                <w:i w:val="0"/>
+                <w:color w:val="222B33"/>
+                <w:sz w:val="23"/>
+                <w:szCs w:val="23"/>
+              </w:rPr>
+              <w:t>۲ از ۲۰</w:t>
+            </w:r>
+          </w:p>
+        </w:tc>
+        <w:tc>
+          <w:tcPr>
+            <w:tcW w:type="dxa" w:w="2409"/>
+          </w:tcPr>
+          <w:p>
+            <w:pPr>
+              <w:bidi w:val="1"/>
+              <w:jc w:val="center"/>
+            </w:pPr>
+            <w:r/>
+            <w:r>
+              <w:rPr>
+                <w:rFonts w:ascii="B Nazanin" w:hAnsi="B Nazanin" w:cs="B Nazanin"/>
+                <w:b/>
+                <w:i w:val="0"/>
+                <w:color w:val="007A3D"/>
+                <w:sz w:val="23"/>
+                <w:szCs w:val="23"/>
+              </w:rPr>
+              <w:t>۱۰٪</w:t>
+            </w:r>
+          </w:p>
+        </w:tc>
+      </w:tr>
+      <w:tr>
+        <w:tc>
+          <w:tcPr>
+            <w:tcW w:type="dxa" w:w="2409"/>
+            <w:shd w:val="clear" w:fill="F2F5F9"/>
+          </w:tcPr>
+          <w:p>
+            <w:pPr>
+              <w:bidi w:val="1"/>
+              <w:jc w:val="center"/>
+            </w:pPr>
+            <w:r/>
+            <w:r>
+              <w:rPr>
+                <w:rFonts w:ascii="B Nazanin" w:hAnsi="B Nazanin" w:cs="B Nazanin"/>
+                <w:b w:val="0"/>
+                <w:i w:val="0"/>
+                <w:color w:val="222B33"/>
+                <w:sz w:val="23"/>
+                <w:szCs w:val="23"/>
+              </w:rPr>
+              <w:t>جمع صندلی‌ها</w:t>
+            </w:r>
+          </w:p>
+        </w:tc>
+        <w:tc>
+          <w:tcPr>
+            <w:tcW w:type="dxa" w:w="2409"/>
+            <w:shd w:val="clear" w:fill="F2F5F9"/>
+          </w:tcPr>
+          <w:p>
+            <w:pPr>
+              <w:bidi w:val="1"/>
+              <w:jc w:val="center"/>
+            </w:pPr>
+            <w:r/>
+            <w:r>
+              <w:rPr>
+                <w:rFonts w:ascii="B Nazanin" w:hAnsi="B Nazanin" w:cs="B Nazanin"/>
+                <w:b w:val="0"/>
+                <w:i w:val="0"/>
+                <w:color w:val="222B33"/>
+                <w:sz w:val="23"/>
+                <w:szCs w:val="23"/>
+              </w:rPr>
+              <w:t>—</w:t>
+            </w:r>
+          </w:p>
+        </w:tc>
+        <w:tc>
+          <w:tcPr>
+            <w:tcW w:type="dxa" w:w="2409"/>
+            <w:shd w:val="clear" w:fill="F2F5F9"/>
+          </w:tcPr>
+          <w:p>
+            <w:pPr>
+              <w:bidi w:val="1"/>
+              <w:jc w:val="center"/>
+            </w:pPr>
+            <w:r/>
+            <w:r>
+              <w:rPr>
+                <w:rFonts w:ascii="B Nazanin" w:hAnsi="B Nazanin" w:cs="B Nazanin"/>
+                <w:b w:val="0"/>
+                <w:i w:val="0"/>
+                <w:color w:val="222B33"/>
+                <w:sz w:val="23"/>
+                <w:szCs w:val="23"/>
+              </w:rPr>
+              <w:t>۸ از ۴۷</w:t>
+            </w:r>
+          </w:p>
+        </w:tc>
+        <w:tc>
+          <w:tcPr>
+            <w:tcW w:type="dxa" w:w="2409"/>
+            <w:shd w:val="clear" w:fill="F2F5F9"/>
+          </w:tcPr>
+          <w:p>
+            <w:pPr>
+              <w:bidi w:val="1"/>
+              <w:jc w:val="center"/>
+            </w:pPr>
+            <w:r/>
+            <w:r>
+              <w:rPr>
+                <w:rFonts w:ascii="B Nazanin" w:hAnsi="B Nazanin" w:cs="B Nazanin"/>
+                <w:b w:val="0"/>
+                <w:i w:val="0"/>
+                <w:color w:val="222B33"/>
+                <w:sz w:val="23"/>
+                <w:szCs w:val="23"/>
+              </w:rPr>
+              <w:t>۱۷٪</w:t>
+            </w:r>
+          </w:p>
+        </w:tc>
+      </w:tr>
+    </w:tbl>
+    <w:p>
+      <w:pPr>
+        <w:spacing w:after="80"/>
+      </w:pPr>
+    </w:p>
+    <w:p>
+      <w:pPr>
+        <w:bidi w:val="1"/>
+        <w:spacing w:before="240" w:after="120"/>
+        <w:jc w:val="right"/>
+      </w:pPr>
+      <w:r>
+        <w:rPr>
+          <w:rFonts w:ascii="B Nazanin" w:hAnsi="B Nazanin" w:cs="B Nazanin"/>
+          <w:b/>
+          <w:i w:val="0"/>
+          <w:color w:val="222B33"/>
+          <w:sz w:val="32"/>
+          <w:szCs w:val="32"/>
+        </w:rPr>
+        <w:t>جریان مالی (سال مالی ۱۴۰)</w:t>
+      </w:r>
+    </w:p>
+    <w:tbl>
+      <w:tblPr>
+        <w:tblW w:type="auto" w:w="0"/>
+        <w:jc w:val="center"/>
+        <w:tblLook w:firstColumn="1" w:firstRow="1" w:lastColumn="0" w:lastRow="0" w:noHBand="0" w:noVBand="1" w:val="04A0"/>
+        <w:tblBorders>
+          <w:top w:val="single" w:sz="4" w:space="0" w:color="D9DDE3"/>
+          <w:left w:val="single" w:sz="4" w:space="0" w:color="D9DDE3"/>
+          <w:bottom w:val="single" w:sz="4" w:space="0" w:color="D9DDE3"/>
+          <w:right w:val="single" w:sz="4" w:space="0" w:color="D9DDE3"/>
+          <w:insideH w:val="single" w:sz="4" w:space="0" w:color="D9DDE3"/>
+          <w:insideV w:val="single" w:sz="4" w:space="0" w:color="D9DDE3"/>
+        </w:tblBorders>
+      </w:tblPr>
+      <w:tblGrid>
+        <w:gridCol w:w="4819"/>
+        <w:gridCol w:w="4819"/>
+      </w:tblGrid>
+      <w:tr>
+        <w:tc>
+          <w:tcPr>
+            <w:tcW w:type="dxa" w:w="4819"/>
+            <w:shd w:val="clear" w:fill="0D47A1"/>
+          </w:tcPr>
+          <w:p>
+            <w:pPr>
+              <w:bidi w:val="1"/>
+              <w:jc w:val="center"/>
+            </w:pPr>
+            <w:r/>
+            <w:r>
+              <w:rPr>
+                <w:rFonts w:ascii="B Nazanin" w:hAnsi="B Nazanin" w:cs="B Nazanin"/>
+                <w:b/>
+                <w:i w:val="0"/>
+                <w:color w:val="FFFFFF"/>
+                <w:sz w:val="24"/>
+                <w:szCs w:val="24"/>
+              </w:rPr>
+              <w:t>مورد</w:t>
+            </w:r>
+          </w:p>
+        </w:tc>
+        <w:tc>
+          <w:tcPr>
+            <w:tcW w:type="dxa" w:w="4819"/>
+            <w:shd w:val="clear" w:fill="0D47A1"/>
+          </w:tcPr>
+          <w:p>
+            <w:pPr>
+              <w:bidi w:val="1"/>
+              <w:jc w:val="center"/>
+            </w:pPr>
+            <w:r/>
+            <w:r>
+              <w:rPr>
+                <w:rFonts w:ascii="B Nazanin" w:hAnsi="B Nazanin" w:cs="B Nazanin"/>
+                <w:b/>
+                <w:i w:val="0"/>
+                <w:color w:val="FFFFFF"/>
+                <w:sz w:val="24"/>
+                <w:szCs w:val="24"/>
+              </w:rPr>
+              <w:t>مبلغ (تومان)</w:t>
+            </w:r>
+          </w:p>
+        </w:tc>
+      </w:tr>
+      <w:tr>
+        <w:tc>
+          <w:tcPr>
+            <w:tcW w:type="dxa" w:w="4819"/>
+          </w:tcPr>
+          <w:p>
+            <w:pPr>
+              <w:bidi w:val="1"/>
+              <w:jc w:val="center"/>
+            </w:pPr>
+            <w:r/>
+            <w:r>
+              <w:rPr>
+                <w:rFonts w:ascii="B Nazanin" w:hAnsi="B Nazanin" w:cs="B Nazanin"/>
+                <w:b w:val="0"/>
+                <w:i w:val="0"/>
+                <w:color w:val="222B33"/>
+                <w:sz w:val="23"/>
+                <w:szCs w:val="23"/>
+              </w:rPr>
+              <w:t>دریافتی اردیبهشت (۲ رسید)</w:t>
+            </w:r>
+          </w:p>
+        </w:tc>
+        <w:tc>
+          <w:tcPr>
+            <w:tcW w:type="dxa" w:w="4819"/>
+          </w:tcPr>
+          <w:p>
+            <w:pPr>
+              <w:bidi w:val="1"/>
+              <w:jc w:val="center"/>
+            </w:pPr>
+            <w:r/>
+            <w:r>
+              <w:rPr>
+                <w:rFonts w:ascii="B Nazanin" w:hAnsi="B Nazanin" w:cs="B Nazanin"/>
+                <w:b w:val="0"/>
+                <w:i w:val="0"/>
+                <w:color w:val="222B33"/>
+                <w:sz w:val="23"/>
+                <w:szCs w:val="23"/>
+              </w:rPr>
+              <w:t>۸,۰۰۰,۰۰۰</w:t>
+            </w:r>
+          </w:p>
+        </w:tc>
+      </w:tr>
+      <w:tr>
+        <w:tc>
+          <w:tcPr>
+            <w:tcW w:type="dxa" w:w="4819"/>
+            <w:shd w:val="clear" w:fill="F2F5F9"/>
+          </w:tcPr>
+          <w:p>
+            <w:pPr>
+              <w:bidi w:val="1"/>
+              <w:jc w:val="center"/>
+            </w:pPr>
+            <w:r/>
+            <w:r>
+              <w:rPr>
+                <w:rFonts w:ascii="B Nazanin" w:hAnsi="B Nazanin" w:cs="B Nazanin"/>
+                <w:b w:val="0"/>
+                <w:i w:val="0"/>
+                <w:color w:val="222B33"/>
+                <w:sz w:val="23"/>
+                <w:szCs w:val="23"/>
+              </w:rPr>
+              <w:t>دریافتی خرداد (۷ رسید)</w:t>
+            </w:r>
+          </w:p>
+        </w:tc>
+        <w:tc>
+          <w:tcPr>
+            <w:tcW w:type="dxa" w:w="4819"/>
+            <w:shd w:val="clear" w:fill="F2F5F9"/>
+          </w:tcPr>
+          <w:p>
+            <w:pPr>
+              <w:bidi w:val="1"/>
+              <w:jc w:val="center"/>
+            </w:pPr>
+            <w:r/>
+            <w:r>
+              <w:rPr>
+                <w:rFonts w:ascii="B Nazanin" w:hAnsi="B Nazanin" w:cs="B Nazanin"/>
+                <w:b w:val="0"/>
+                <w:i w:val="0"/>
+                <w:color w:val="222B33"/>
+                <w:sz w:val="23"/>
+                <w:szCs w:val="23"/>
+              </w:rPr>
+              <w:t>۳۴,۵۰۰,۰۰۰</w:t>
+            </w:r>
+          </w:p>
+        </w:tc>
+      </w:tr>
+      <w:tr>
+        <w:tc>
+          <w:tcPr>
+            <w:tcW w:type="dxa" w:w="4819"/>
+          </w:tcPr>
+          <w:p>
+            <w:pPr>
+              <w:bidi w:val="1"/>
+              <w:jc w:val="center"/>
+            </w:pPr>
+            <w:r/>
+            <w:r>
+              <w:rPr>
+                <w:rFonts w:ascii="B Nazanin" w:hAnsi="B Nazanin" w:cs="B Nazanin"/>
+                <w:b w:val="0"/>
+                <w:i w:val="0"/>
+                <w:color w:val="222B33"/>
+                <w:sz w:val="23"/>
+                <w:szCs w:val="23"/>
+              </w:rPr>
+              <w:t>مجموع دریافتی سال</w:t>
+            </w:r>
+          </w:p>
+        </w:tc>
+        <w:tc>
+          <w:tcPr>
+            <w:tcW w:type="dxa" w:w="4819"/>
+          </w:tcPr>
+          <w:p>
+            <w:pPr>
+              <w:bidi w:val="1"/>
+              <w:jc w:val="center"/>
+            </w:pPr>
+            <w:r/>
+            <w:r>
+              <w:rPr>
+                <w:rFonts w:ascii="B Nazanin" w:hAnsi="B Nazanin" w:cs="B Nazanin"/>
+                <w:b/>
+                <w:i w:val="0"/>
+                <w:color w:val="007A3D"/>
+                <w:sz w:val="23"/>
+                <w:szCs w:val="23"/>
+              </w:rPr>
+              <w:t>۴۲,۵۰۰,۰۰۰</w:t>
+            </w:r>
+          </w:p>
+        </w:tc>
+      </w:tr>
+      <w:tr>
+        <w:tc>
+          <w:tcPr>
+            <w:tcW w:type="dxa" w:w="4819"/>
+            <w:shd w:val="clear" w:fill="F2F5F9"/>
+          </w:tcPr>
+          <w:p>
+            <w:pPr>
+              <w:bidi w:val="1"/>
+              <w:jc w:val="center"/>
+            </w:pPr>
+            <w:r/>
+            <w:r>
+              <w:rPr>
+                <w:rFonts w:ascii="B Nazanin" w:hAnsi="B Nazanin" w:cs="B Nazanin"/>
+                <w:b w:val="0"/>
+                <w:i w:val="0"/>
+                <w:color w:val="222B33"/>
+                <w:sz w:val="23"/>
+                <w:szCs w:val="23"/>
+              </w:rPr>
+              <w:t>هزینه‌های ثبت‌شده</w:t>
+            </w:r>
+          </w:p>
+        </w:tc>
+        <w:tc>
+          <w:tcPr>
+            <w:tcW w:type="dxa" w:w="4819"/>
+            <w:shd w:val="clear" w:fill="F2F5F9"/>
+          </w:tcPr>
+          <w:p>
+            <w:pPr>
+              <w:bidi w:val="1"/>
+              <w:jc w:val="center"/>
+            </w:pPr>
+            <w:r/>
+            <w:r>
+              <w:rPr>
+                <w:rFonts w:ascii="B Nazanin" w:hAnsi="B Nazanin" w:cs="B Nazanin"/>
+                <w:b w:val="0"/>
+                <w:i w:val="0"/>
+                <w:color w:val="222B33"/>
+                <w:sz w:val="23"/>
+                <w:szCs w:val="23"/>
+              </w:rPr>
+              <w:t>۰</w:t>
+            </w:r>
+          </w:p>
+        </w:tc>
+      </w:tr>
+      <w:tr>
+        <w:tc>
+          <w:tcPr>
+            <w:tcW w:type="dxa" w:w="4819"/>
+          </w:tcPr>
+          <w:p>
+            <w:pPr>
+              <w:bidi w:val="1"/>
+              <w:jc w:val="center"/>
+            </w:pPr>
+            <w:r/>
+            <w:r>
+              <w:rPr>
+                <w:rFonts w:ascii="B Nazanin" w:hAnsi="B Nazanin" w:cs="B Nazanin"/>
+                <w:b w:val="0"/>
+                <w:i w:val="0"/>
+                <w:color w:val="222B33"/>
+                <w:sz w:val="23"/>
+                <w:szCs w:val="23"/>
+              </w:rPr>
+              <w:t>سود خالص تا این لحظه</w:t>
+            </w:r>
+          </w:p>
+        </w:tc>
+        <w:tc>
+          <w:tcPr>
+            <w:tcW w:type="dxa" w:w="4819"/>
+          </w:tcPr>
+          <w:p>
+            <w:pPr>
+              <w:bidi w:val="1"/>
+              <w:jc w:val="center"/>
+            </w:pPr>
+            <w:r/>
+            <w:r>
+              <w:rPr>
+                <w:rFonts w:ascii="B Nazanin" w:hAnsi="B Nazanin" w:cs="B Nazanin"/>
+                <w:b/>
+                <w:i w:val="0"/>
+                <w:color w:val="007A3D"/>
+                <w:sz w:val="23"/>
+                <w:szCs w:val="23"/>
+              </w:rPr>
+              <w:t>۴۲,۵۰۰,۰۰۰</w:t>
+            </w:r>
+          </w:p>
+        </w:tc>
+      </w:tr>
+      <w:tr>
+        <w:tc>
+          <w:tcPr>
+            <w:tcW w:type="dxa" w:w="4819"/>
+            <w:shd w:val="clear" w:fill="F2F5F9"/>
+          </w:tcPr>
+          <w:p>
+            <w:pPr>
+              <w:bidi w:val="1"/>
+              <w:jc w:val="center"/>
+            </w:pPr>
+            <w:r/>
+            <w:r>
+              <w:rPr>
+                <w:rFonts w:ascii="B Nazanin" w:hAnsi="B Nazanin" w:cs="B Nazanin"/>
+                <w:b w:val="0"/>
+                <w:i w:val="0"/>
+                <w:color w:val="222B33"/>
+                <w:sz w:val="23"/>
+                <w:szCs w:val="23"/>
+              </w:rPr>
+              <w:t>موجودی فعلی صندوق</w:t>
+            </w:r>
+          </w:p>
+        </w:tc>
+        <w:tc>
+          <w:tcPr>
+            <w:tcW w:type="dxa" w:w="4819"/>
+            <w:shd w:val="clear" w:fill="F2F5F9"/>
+          </w:tcPr>
+          <w:p>
+            <w:pPr>
+              <w:bidi w:val="1"/>
+              <w:jc w:val="center"/>
+            </w:pPr>
+            <w:r/>
+            <w:r>
+              <w:rPr>
+                <w:rFonts w:ascii="B Nazanin" w:hAnsi="B Nazanin" w:cs="B Nazanin"/>
+                <w:b/>
+                <w:i w:val="0"/>
+                <w:color w:val="007A3D"/>
+                <w:sz w:val="23"/>
+                <w:szCs w:val="23"/>
+              </w:rPr>
+              <w:t>۴۲,۵۰۰,۰۰۰</w:t>
+            </w:r>
+          </w:p>
+        </w:tc>
+      </w:tr>
+      <w:tr>
+        <w:tc>
+          <w:tcPr>
+            <w:tcW w:type="dxa" w:w="4819"/>
+          </w:tcPr>
+          <w:p>
+            <w:pPr>
+              <w:bidi w:val="1"/>
+              <w:jc w:val="center"/>
+            </w:pPr>
+            <w:r/>
+            <w:r>
+              <w:rPr>
+                <w:rFonts w:ascii="B Nazanin" w:hAnsi="B Nazanin" w:cs="B Nazanin"/>
+                <w:b w:val="0"/>
+                <w:i w:val="0"/>
+                <w:color w:val="222B33"/>
+                <w:sz w:val="23"/>
+                <w:szCs w:val="23"/>
+              </w:rPr>
+              <w:t>اقساط پیش‌رو (۲۱ قسط)</w:t>
+            </w:r>
+          </w:p>
+        </w:tc>
+        <w:tc>
+          <w:tcPr>
+            <w:tcW w:type="dxa" w:w="4819"/>
+          </w:tcPr>
+          <w:p>
+            <w:pPr>
+              <w:bidi w:val="1"/>
+              <w:jc w:val="center"/>
+            </w:pPr>
+            <w:r/>
+            <w:r>
+              <w:rPr>
+                <w:rFonts w:ascii="B Nazanin" w:hAnsi="B Nazanin" w:cs="B Nazanin"/>
+                <w:b w:val="0"/>
+                <w:i w:val="0"/>
+                <w:color w:val="222B33"/>
+                <w:sz w:val="23"/>
+                <w:szCs w:val="23"/>
+              </w:rPr>
+              <w:t>۳۷,۳۹۹,۹۹۵</w:t>
+            </w:r>
+          </w:p>
+        </w:tc>
+      </w:tr>
+    </w:tbl>
+    <w:p>
+      <w:pPr>
+        <w:spacing w:after="80"/>
+      </w:pPr>
+    </w:p>
+    <w:p>
+      <w:pPr>
+        <w:bidi w:val="1"/>
+        <w:spacing w:before="240" w:after="120"/>
+        <w:jc w:val="right"/>
+      </w:pPr>
+      <w:r>
+        <w:rPr>
+          <w:rFonts w:ascii="B Nazanin" w:hAnsi="B Nazanin" w:cs="B Nazanin"/>
+          <w:b/>
+          <w:i w:val="0"/>
+          <w:color w:val="222B33"/>
+          <w:sz w:val="32"/>
+          <w:szCs w:val="32"/>
+        </w:rPr>
+        <w:t>کیفیت آموزشی</w:t>
+      </w:r>
+    </w:p>
+    <w:tbl>
+      <w:tblPr>
+        <w:tblW w:type="auto" w:w="0"/>
+        <w:jc w:val="center"/>
+        <w:tblLook w:firstColumn="1" w:firstRow="1" w:lastColumn="0" w:lastRow="0" w:noHBand="0" w:noVBand="1" w:val="04A0"/>
+        <w:tblBorders>
+          <w:top w:val="single" w:sz="4" w:space="0" w:color="D9DDE3"/>
+          <w:left w:val="single" w:sz="4" w:space="0" w:color="D9DDE3"/>
+          <w:bottom w:val="single" w:sz="4" w:space="0" w:color="D9DDE3"/>
+          <w:right w:val="single" w:sz="4" w:space="0" w:color="D9DDE3"/>
+          <w:insideH w:val="single" w:sz="4" w:space="0" w:color="D9DDE3"/>
+          <w:insideV w:val="single" w:sz="4" w:space="0" w:color="D9DDE3"/>
+        </w:tblBorders>
+      </w:tblPr>
+      <w:tblGrid>
+        <w:gridCol w:w="4819"/>
+        <w:gridCol w:w="4819"/>
+      </w:tblGrid>
+      <w:tr>
+        <w:tc>
+          <w:tcPr>
+            <w:tcW w:type="dxa" w:w="4819"/>
+            <w:shd w:val="clear" w:fill="0D47A1"/>
+          </w:tcPr>
+          <w:p>
+            <w:pPr>
+              <w:bidi w:val="1"/>
+              <w:jc w:val="center"/>
+            </w:pPr>
+            <w:r/>
+            <w:r>
+              <w:rPr>
+                <w:rFonts w:ascii="B Nazanin" w:hAnsi="B Nazanin" w:cs="B Nazanin"/>
+                <w:b/>
+                <w:i w:val="0"/>
+                <w:color w:val="FFFFFF"/>
+                <w:sz w:val="24"/>
+                <w:szCs w:val="24"/>
+              </w:rPr>
+              <w:t>مورد</w:t>
+            </w:r>
+          </w:p>
+        </w:tc>
+        <w:tc>
+          <w:tcPr>
+            <w:tcW w:type="dxa" w:w="4819"/>
+            <w:shd w:val="clear" w:fill="0D47A1"/>
+          </w:tcPr>
+          <w:p>
+            <w:pPr>
+              <w:bidi w:val="1"/>
+              <w:jc w:val="center"/>
+            </w:pPr>
+            <w:r/>
+            <w:r>
+              <w:rPr>
+                <w:rFonts w:ascii="B Nazanin" w:hAnsi="B Nazanin" w:cs="B Nazanin"/>
+                <w:b/>
+                <w:i w:val="0"/>
+                <w:color w:val="FFFFFF"/>
+                <w:sz w:val="24"/>
+                <w:szCs w:val="24"/>
+              </w:rPr>
+              <w:t>مقدار</w:t>
+            </w:r>
+          </w:p>
+        </w:tc>
+      </w:tr>
+      <w:tr>
+        <w:tc>
+          <w:tcPr>
+            <w:tcW w:type="dxa" w:w="4819"/>
+          </w:tcPr>
+          <w:p>
+            <w:pPr>
+              <w:bidi w:val="1"/>
+              <w:jc w:val="center"/>
+            </w:pPr>
+            <w:r/>
+            <w:r>
+              <w:rPr>
+                <w:rFonts w:ascii="B Nazanin" w:hAnsi="B Nazanin" w:cs="B Nazanin"/>
+                <w:b w:val="0"/>
+                <w:i w:val="0"/>
+                <w:color w:val="222B33"/>
+                <w:sz w:val="23"/>
+                <w:szCs w:val="23"/>
+              </w:rPr>
+              <w:t>درصد حضور کلاس Python (۸ جلسه)</w:t>
+            </w:r>
+          </w:p>
+        </w:tc>
+        <w:tc>
+          <w:tcPr>
+            <w:tcW w:type="dxa" w:w="4819"/>
+          </w:tcPr>
+          <w:p>
+            <w:pPr>
+              <w:bidi w:val="1"/>
+              <w:jc w:val="center"/>
+            </w:pPr>
+            <w:r/>
+            <w:r>
+              <w:rPr>
+                <w:rFonts w:ascii="B Nazanin" w:hAnsi="B Nazanin" w:cs="B Nazanin"/>
+                <w:b/>
+                <w:i w:val="0"/>
+                <w:color w:val="007A3D"/>
+                <w:sz w:val="23"/>
+                <w:szCs w:val="23"/>
+              </w:rPr>
+              <w:t>۸۸.۹٪ (۱۶ از ۱۸ ثبت‌نام)</w:t>
+            </w:r>
+          </w:p>
+        </w:tc>
+      </w:tr>
+      <w:tr>
+        <w:tc>
+          <w:tcPr>
+            <w:tcW w:type="dxa" w:w="4819"/>
+            <w:shd w:val="clear" w:fill="F2F5F9"/>
+          </w:tcPr>
+          <w:p>
+            <w:pPr>
+              <w:bidi w:val="1"/>
+              <w:jc w:val="center"/>
+            </w:pPr>
+            <w:r/>
+            <w:r>
+              <w:rPr>
+                <w:rFonts w:ascii="B Nazanin" w:hAnsi="B Nazanin" w:cs="B Nazanin"/>
+                <w:b w:val="0"/>
+                <w:i w:val="0"/>
+                <w:color w:val="222B33"/>
+                <w:sz w:val="23"/>
+                <w:szCs w:val="23"/>
+              </w:rPr>
+              <w:t>آزمون‌های برگزارشده</w:t>
+            </w:r>
+          </w:p>
+        </w:tc>
+        <w:tc>
+          <w:tcPr>
+            <w:tcW w:type="dxa" w:w="4819"/>
+            <w:shd w:val="clear" w:fill="F2F5F9"/>
+          </w:tcPr>
+          <w:p>
+            <w:pPr>
+              <w:bidi w:val="1"/>
+              <w:jc w:val="center"/>
+            </w:pPr>
+            <w:r/>
+            <w:r>
+              <w:rPr>
+                <w:rFonts w:ascii="B Nazanin" w:hAnsi="B Nazanin" w:cs="B Nazanin"/>
+                <w:b w:val="0"/>
+                <w:i w:val="0"/>
+                <w:color w:val="222B33"/>
+                <w:sz w:val="23"/>
+                <w:szCs w:val="23"/>
+              </w:rPr>
+              <w:t>۱ آزمون</w:t>
+            </w:r>
+          </w:p>
+        </w:tc>
+      </w:tr>
+      <w:tr>
+        <w:tc>
+          <w:tcPr>
+            <w:tcW w:type="dxa" w:w="4819"/>
+          </w:tcPr>
+          <w:p>
+            <w:pPr>
+              <w:bidi w:val="1"/>
+              <w:jc w:val="center"/>
+            </w:pPr>
+            <w:r/>
+            <w:r>
+              <w:rPr>
+                <w:rFonts w:ascii="B Nazanin" w:hAnsi="B Nazanin" w:cs="B Nazanin"/>
+                <w:b w:val="0"/>
+                <w:i w:val="0"/>
+                <w:color w:val="222B33"/>
+                <w:sz w:val="23"/>
+                <w:szCs w:val="23"/>
+              </w:rPr>
+              <w:t>درصد قبولی</w:t>
+            </w:r>
+          </w:p>
+        </w:tc>
+        <w:tc>
+          <w:tcPr>
+            <w:tcW w:type="dxa" w:w="4819"/>
+          </w:tcPr>
+          <w:p>
+            <w:pPr>
+              <w:bidi w:val="1"/>
+              <w:jc w:val="center"/>
+            </w:pPr>
+            <w:r/>
+            <w:r>
+              <w:rPr>
+                <w:rFonts w:ascii="B Nazanin" w:hAnsi="B Nazanin" w:cs="B Nazanin"/>
+                <w:b/>
+                <w:i w:val="0"/>
+                <w:color w:val="007A3D"/>
+                <w:sz w:val="23"/>
+                <w:szCs w:val="23"/>
+              </w:rPr>
+              <w:t>۱۰۰٪ (۳ از ۳)</w:t>
+            </w:r>
+          </w:p>
+        </w:tc>
+      </w:tr>
+      <w:tr>
+        <w:tc>
+          <w:tcPr>
+            <w:tcW w:type="dxa" w:w="4819"/>
+            <w:shd w:val="clear" w:fill="F2F5F9"/>
+          </w:tcPr>
+          <w:p>
+            <w:pPr>
+              <w:bidi w:val="1"/>
+              <w:jc w:val="center"/>
+            </w:pPr>
+            <w:r/>
+            <w:r>
+              <w:rPr>
+                <w:rFonts w:ascii="B Nazanin" w:hAnsi="B Nazanin" w:cs="B Nazanin"/>
+                <w:b w:val="0"/>
+                <w:i w:val="0"/>
+                <w:color w:val="222B33"/>
+                <w:sz w:val="23"/>
+                <w:szCs w:val="23"/>
+              </w:rPr>
+              <w:t>میانگین نمره کل</w:t>
+            </w:r>
+          </w:p>
+        </w:tc>
+        <w:tc>
+          <w:tcPr>
+            <w:tcW w:type="dxa" w:w="4819"/>
+            <w:shd w:val="clear" w:fill="F2F5F9"/>
+          </w:tcPr>
+          <w:p>
+            <w:pPr>
+              <w:bidi w:val="1"/>
+              <w:jc w:val="center"/>
+            </w:pPr>
+            <w:r/>
+            <w:r>
+              <w:rPr>
+                <w:rFonts w:ascii="B Nazanin" w:hAnsi="B Nazanin" w:cs="B Nazanin"/>
+                <w:b w:val="0"/>
+                <w:i w:val="0"/>
+                <w:color w:val="222B33"/>
+                <w:sz w:val="23"/>
+                <w:szCs w:val="23"/>
+              </w:rPr>
+              <w:t>۷۷.۶</w:t>
+            </w:r>
+          </w:p>
+        </w:tc>
+      </w:tr>
+    </w:tbl>
+    <w:p>
+      <w:pPr>
+        <w:spacing w:after="80"/>
+      </w:pPr>
+    </w:p>
+    <w:p>
+      <w:pPr>
+        <w:bidi w:val="1"/>
+        <w:spacing w:after="240"/>
+        <w:ind w:right="454" w:left="454"/>
+        <w:jc w:val="right"/>
+        <w:pBdr>
+          <w:right w:val="single" w:sz="18" w:space="8" w:color="0D47A1"/>
+        </w:pBdr>
+      </w:pPr>
+      <w:r>
+        <w:rPr>
+          <w:rFonts w:ascii="B Nazanin" w:hAnsi="B Nazanin" w:cs="B Nazanin"/>
+          <w:b w:val="0"/>
+          <w:i w:val="0"/>
+          <w:color w:val="555555"/>
+          <w:sz w:val="24"/>
+          <w:szCs w:val="24"/>
+        </w:rPr>
+        <w:t>هیچ‌کدام از این اعداد ساختگی نیست — همین حالا از دیتابیس دیتای زنده‌ی محیط دمو خوانده شده‌اند و با هر تراکنش جدید شما به‌روز می‌شوند.</w:t>
+      </w:r>
+    </w:p>
+    <w:p>
+      <w:pPr>
+        <w:bidi w:val="1"/>
+        <w:spacing w:before="400" w:after="200"/>
+        <w:jc w:val="right"/>
+        <w:pBdr>
+          <w:bottom w:val="single" w:sz="8" w:space="4" w:color="0D47A1"/>
+        </w:pBdr>
+      </w:pPr>
+      <w:r>
+        <w:rPr>
+          <w:rFonts w:ascii="B Nazanin" w:hAnsi="B Nazanin" w:cs="B Nazanin"/>
+          <w:b/>
+          <w:i w:val="0"/>
+          <w:color w:val="0D47A1"/>
+          <w:sz w:val="40"/>
+          <w:szCs w:val="40"/>
+        </w:rPr>
+        <w:t xml:space="preserve">۱۷  </w:t>
+      </w:r>
+      <w:r>
+        <w:rPr>
+          <w:rFonts w:ascii="B Nazanin" w:hAnsi="B Nazanin" w:cs="B Nazanin"/>
+          <w:b/>
+          <w:i w:val="0"/>
+          <w:color w:val="0D47A1"/>
+          <w:sz w:val="40"/>
+          <w:szCs w:val="40"/>
+        </w:rPr>
         <w:t>مزایای رقابتی — چرا آکادمی‌منیجر پرو؟</w:t>
       </w:r>
     </w:p>
@@ -4657,7 +6484,7 @@
           <w:sz w:val="40"/>
           <w:szCs w:val="40"/>
         </w:rPr>
-        <w:t xml:space="preserve">۱۷  </w:t>
+        <w:t xml:space="preserve">۱۸  </w:t>
       </w:r>
       <w:r>
         <w:rPr>
@@ -4995,6 +6822,208 @@
         <w:spacing w:after="80"/>
       </w:pPr>
     </w:p>
+    <w:p>
+      <w:pPr>
+        <w:bidi w:val="1"/>
+        <w:spacing w:before="400" w:after="200"/>
+        <w:jc w:val="right"/>
+        <w:pBdr>
+          <w:bottom w:val="single" w:sz="8" w:space="4" w:color="0D47A1"/>
+        </w:pBdr>
+      </w:pPr>
+      <w:r>
+        <w:rPr>
+          <w:rFonts w:ascii="B Nazanin" w:hAnsi="B Nazanin" w:cs="B Nazanin"/>
+          <w:b/>
+          <w:i w:val="0"/>
+          <w:color w:val="0D47A1"/>
+          <w:sz w:val="40"/>
+          <w:szCs w:val="40"/>
+        </w:rPr>
+        <w:t xml:space="preserve">۱۹  </w:t>
+      </w:r>
+      <w:r>
+        <w:rPr>
+          <w:rFonts w:ascii="B Nazanin" w:hAnsi="B Nazanin" w:cs="B Nazanin"/>
+          <w:b/>
+          <w:i w:val="0"/>
+          <w:color w:val="0D47A1"/>
+          <w:sz w:val="40"/>
+          <w:szCs w:val="40"/>
+        </w:rPr>
+        <w:t>پرسش‌های پرتکرار</w:t>
+      </w:r>
+    </w:p>
+    <w:p>
+      <w:pPr>
+        <w:bidi w:val="1"/>
+        <w:spacing w:before="240" w:after="120"/>
+        <w:jc w:val="right"/>
+      </w:pPr>
+      <w:r>
+        <w:rPr>
+          <w:rFonts w:ascii="B Nazanin" w:hAnsi="B Nazanin" w:cs="B Nazanin"/>
+          <w:b/>
+          <w:i w:val="0"/>
+          <w:color w:val="222B33"/>
+          <w:sz w:val="32"/>
+          <w:szCs w:val="32"/>
+        </w:rPr>
+        <w:t>هزینه‌ی نرم‌افزار چقدر است؟</w:t>
+      </w:r>
+    </w:p>
+    <w:p>
+      <w:pPr>
+        <w:bidi w:val="1"/>
+        <w:spacing w:after="200" w:before="0"/>
+        <w:ind w:firstLine="357"/>
+        <w:jc w:val="both"/>
+      </w:pPr>
+      <w:r>
+        <w:rPr>
+          <w:rFonts w:ascii="B Nazanin" w:hAnsi="B Nazanin" w:cs="B Nazanin"/>
+          <w:b w:val="0"/>
+          <w:i w:val="0"/>
+          <w:color w:val="222B33"/>
+          <w:sz w:val="28"/>
+          <w:szCs w:val="28"/>
+        </w:rPr>
+        <w:t xml:space="preserve">اشتراک ماهانه‌ی پیچیده‌ای وجود ندارد؛ نرم‌افزار با </w:t>
+      </w:r>
+      <w:r>
+        <w:rPr>
+          <w:rFonts w:ascii="B Nazanin" w:hAnsi="B Nazanin" w:cs="B Nazanin"/>
+          <w:b/>
+          <w:i w:val="0"/>
+          <w:color w:val="222B33"/>
+          <w:sz w:val="28"/>
+          <w:szCs w:val="28"/>
+        </w:rPr>
+        <w:t>یک لایسنس واحد</w:t>
+      </w:r>
+      <w:r>
+        <w:rPr>
+          <w:rFonts w:ascii="B Nazanin" w:hAnsi="B Nazanin" w:cs="B Nazanin"/>
+          <w:b w:val="0"/>
+          <w:i w:val="0"/>
+          <w:color w:val="222B33"/>
+          <w:sz w:val="28"/>
+          <w:szCs w:val="28"/>
+        </w:rPr>
+        <w:t xml:space="preserve"> صادر می‌شود. مبلغ دقیق، در جلسه‌ی دمو ۳۰ دقیقه‌ای (رایگان) بر اساس تعداد شعب و نیاز شما اعلام می‌شود.</w:t>
+      </w:r>
+    </w:p>
+    <w:p>
+      <w:pPr>
+        <w:bidi w:val="1"/>
+        <w:spacing w:before="240" w:after="120"/>
+        <w:jc w:val="right"/>
+      </w:pPr>
+      <w:r>
+        <w:rPr>
+          <w:rFonts w:ascii="B Nazanin" w:hAnsi="B Nazanin" w:cs="B Nazanin"/>
+          <w:b/>
+          <w:i w:val="0"/>
+          <w:color w:val="222B33"/>
+          <w:sz w:val="32"/>
+          <w:szCs w:val="32"/>
+        </w:rPr>
+        <w:t>آیا باید کارمندانم را آموزش بدهم؟</w:t>
+      </w:r>
+    </w:p>
+    <w:p>
+      <w:pPr>
+        <w:bidi w:val="1"/>
+        <w:spacing w:after="200" w:before="0"/>
+        <w:ind w:firstLine="357"/>
+        <w:jc w:val="both"/>
+      </w:pPr>
+      <w:r>
+        <w:rPr>
+          <w:rFonts w:ascii="B Nazanin" w:hAnsi="B Nazanin" w:cs="B Nazanin"/>
+          <w:b w:val="0"/>
+          <w:i w:val="0"/>
+          <w:color w:val="222B33"/>
+          <w:sz w:val="28"/>
+          <w:szCs w:val="28"/>
+        </w:rPr>
+        <w:t>خیر — رابط کاربری کاملاً فارسی است و کارهای روزانه (حضور و غیاب، ثبت‌نام، دریافت وجه) در یک یا دو کلیک انجام می‌شود. در اولین جلسه‌ی رایگان، سیستم را با داده‌های خودتان راه‌اندازی و به‌صورت عملی راهنمایی می‌کنیم.</w:t>
+      </w:r>
+    </w:p>
+    <w:p>
+      <w:pPr>
+        <w:bidi w:val="1"/>
+        <w:spacing w:before="240" w:after="120"/>
+        <w:jc w:val="right"/>
+      </w:pPr>
+      <w:r>
+        <w:rPr>
+          <w:rFonts w:ascii="B Nazanin" w:hAnsi="B Nazanin" w:cs="B Nazanin"/>
+          <w:b/>
+          <w:i w:val="0"/>
+          <w:color w:val="222B33"/>
+          <w:sz w:val="32"/>
+          <w:szCs w:val="32"/>
+        </w:rPr>
+        <w:t>داده‌های من امن است؟</w:t>
+      </w:r>
+    </w:p>
+    <w:p>
+      <w:pPr>
+        <w:bidi w:val="1"/>
+        <w:spacing w:after="200" w:before="0"/>
+        <w:ind w:firstLine="357"/>
+        <w:jc w:val="both"/>
+      </w:pPr>
+      <w:r>
+        <w:rPr>
+          <w:rFonts w:ascii="B Nazanin" w:hAnsi="B Nazanin" w:cs="B Nazanin"/>
+          <w:b w:val="0"/>
+          <w:i w:val="0"/>
+          <w:color w:val="222B33"/>
+          <w:sz w:val="28"/>
+          <w:szCs w:val="28"/>
+        </w:rPr>
+        <w:t>بله. داده‌ها روی شبکه‌ی محلی خودتان ذخیره می‌شوند (نیازی به ارسال به سرورهای شخص ثالث نیست)، پشتیبان‌گیری خودکار و زمان‌بندی‌شده دارید، چند کاربر با نقش و مجوزهای جداگانه می‌توانند کار کنند و هر ورود با IP و زمان کامل لاگ می‌شود.</w:t>
+      </w:r>
+    </w:p>
+    <w:p>
+      <w:pPr>
+        <w:bidi w:val="1"/>
+        <w:spacing w:before="240" w:after="120"/>
+        <w:jc w:val="right"/>
+      </w:pPr>
+      <w:r>
+        <w:rPr>
+          <w:rFonts w:ascii="B Nazanin" w:hAnsi="B Nazanin" w:cs="B Nazanin"/>
+          <w:b/>
+          <w:i w:val="0"/>
+          <w:color w:val="222B33"/>
+          <w:sz w:val="32"/>
+          <w:szCs w:val="32"/>
+        </w:rPr>
+        <w:t>حالا که اکسل یا نرم‌افزار دیگری استفاده می‌کنم، مهاجرت داده‌ها چطور است؟</w:t>
+      </w:r>
+    </w:p>
+    <w:p>
+      <w:pPr>
+        <w:bidi w:val="1"/>
+        <w:spacing w:after="200" w:before="0"/>
+        <w:ind w:firstLine="357"/>
+        <w:jc w:val="both"/>
+      </w:pPr>
+      <w:r>
+        <w:rPr>
+          <w:rFonts w:ascii="B Nazanin" w:hAnsi="B Nazanin" w:cs="B Nazanin"/>
+          <w:b w:val="0"/>
+          <w:i w:val="0"/>
+          <w:color w:val="222B33"/>
+          <w:sz w:val="28"/>
+          <w:szCs w:val="28"/>
+        </w:rPr>
+        <w:t>داده‌های موجود شما — هنرجویان، شهریه‌ها و وضعیت مالی — در اولین جلسه توسط تیم ما وارد نرم‌افزار می‌شود تا بدون گم شدن حتی یک عدد، جابه‌جا شوید.</w:t>
+      </w:r>
+    </w:p>
     <w:tbl>
       <w:tblPr>
         <w:tblW w:type="auto" w:w="0"/>

</xml_diff>